<commit_message>
added log normal dls calibratoin, conversion factor, comparison plots, and dls data
</commit_message>
<xml_diff>
--- a/Single_Liposome_Curvature_Assay_Protocol.docx
+++ b/Single_Liposome_Curvature_Assay_Protocol.docx
@@ -435,7 +435,15 @@
           <w:bCs/>
           <w:color w:val="2E7D32"/>
         </w:rPr>
-        <w:t xml:space="preserve">✅ Tip: </w:t>
+        <w:t>✅</w:t>
+      </w:r>
+      <w:r>
+        <w:rPr>
+          <w:b/>
+          <w:bCs/>
+          <w:color w:val="2E7D32"/>
+        </w:rPr>
+        <w:t xml:space="preserve"> Tip: </w:t>
       </w:r>
       <w:r>
         <w:rPr>
@@ -589,7 +597,23 @@
           <w:bCs/>
           <w:color w:val="2B5797"/>
         </w:rPr>
-        <w:t xml:space="preserve">ℹ️ Note: </w:t>
+        <w:t>ℹ</w:t>
+      </w:r>
+      <w:r>
+        <w:rPr>
+          <w:b/>
+          <w:bCs/>
+          <w:color w:val="2B5797"/>
+        </w:rPr>
+        <w:t>️</w:t>
+      </w:r>
+      <w:r>
+        <w:rPr>
+          <w:b/>
+          <w:bCs/>
+          <w:color w:val="2B5797"/>
+        </w:rPr>
+        <w:t xml:space="preserve"> Note: </w:t>
       </w:r>
       <w:r>
         <w:rPr>
@@ -763,7 +787,7 @@
         <w:spacing w:after="120"/>
       </w:pPr>
       <w:r>
-        <w:t xml:space="preserve">If MATLAB is already installed on your device, skip to step 3 below.</w:t>
+        <w:t>If MATLAB is already installed on your device, skip to step 3 below.</w:t>
       </w:r>
     </w:p>
     <w:p>
@@ -1053,7 +1077,15 @@
           <w:bCs/>
           <w:color w:val="2E7D32"/>
         </w:rPr>
-        <w:t xml:space="preserve">✅ Tip: </w:t>
+        <w:t>✅</w:t>
+      </w:r>
+      <w:r>
+        <w:rPr>
+          <w:b/>
+          <w:bCs/>
+          <w:color w:val="2E7D32"/>
+        </w:rPr>
+        <w:t xml:space="preserve"> Tip: </w:t>
       </w:r>
       <w:r>
         <w:rPr>
@@ -1099,7 +1131,6 @@
           <w:sz w:val="19"/>
           <w:szCs w:val="19"/>
         </w:rPr>
-        <w:lastRenderedPageBreak/>
         <w:t>uv venv</w:t>
       </w:r>
     </w:p>
@@ -1262,7 +1293,19 @@
         <w:rPr>
           <w:color w:val="C00000"/>
         </w:rPr>
-        <w:t xml:space="preserve">⚠️ </w:t>
+        <w:t>⚠</w:t>
+      </w:r>
+      <w:r>
+        <w:rPr>
+          <w:color w:val="C00000"/>
+        </w:rPr>
+        <w:t>️</w:t>
+      </w:r>
+      <w:r>
+        <w:rPr>
+          <w:color w:val="C00000"/>
+        </w:rPr>
+        <w:t xml:space="preserve"> </w:t>
       </w:r>
       <w:r>
         <w:rPr>
@@ -1534,13 +1577,19 @@
         <w:shd w:val="clear" w:color="auto" w:fill="F2F2F2"/>
         <w:spacing w:before="40" w:after="40"/>
         <w:ind w:left="360"/>
-      </w:pPr>
-      <w:r>
-        <w:rPr>
-          <w:rFonts w:ascii="Consolas" w:eastAsia="Consolas" w:hAnsi="Consolas" w:cs="Consolas"/>
-          <w:sz w:val="19"/>
-          <w:szCs w:val="19"/>
-        </w:rPr>
+        <w:rPr>
+          <w:rFonts w:ascii="Consolas" w:eastAsia="Consolas" w:hAnsi="Consolas" w:cs="Consolas"/>
+          <w:sz w:val="19"/>
+          <w:szCs w:val="19"/>
+        </w:rPr>
+      </w:pPr>
+      <w:r>
+        <w:rPr>
+          <w:rFonts w:ascii="Consolas" w:eastAsia="Consolas" w:hAnsi="Consolas" w:cs="Consolas"/>
+          <w:sz w:val="19"/>
+          <w:szCs w:val="19"/>
+        </w:rPr>
+        <w:lastRenderedPageBreak/>
         <w:t>├── figures/              ← PLOTS SAVED HERE</w:t>
       </w:r>
     </w:p>
@@ -1556,6 +1605,100 @@
           <w:sz w:val="19"/>
           <w:szCs w:val="19"/>
         </w:rPr>
+        <w:t xml:space="preserve">├── </w:t>
+      </w:r>
+      <w:proofErr w:type="spellStart"/>
+      <w:r>
+        <w:rPr>
+          <w:rFonts w:ascii="Consolas" w:eastAsia="Consolas" w:hAnsi="Consolas" w:cs="Consolas"/>
+          <w:sz w:val="19"/>
+          <w:szCs w:val="19"/>
+        </w:rPr>
+        <w:t>test_data</w:t>
+      </w:r>
+      <w:proofErr w:type="spellEnd"/>
+      <w:r>
+        <w:rPr>
+          <w:rFonts w:ascii="Consolas" w:eastAsia="Consolas" w:hAnsi="Consolas" w:cs="Consolas"/>
+          <w:sz w:val="19"/>
+          <w:szCs w:val="19"/>
+        </w:rPr>
+        <w:t>/</w:t>
+      </w:r>
+      <w:r>
+        <w:rPr>
+          <w:rFonts w:ascii="Consolas" w:eastAsia="Consolas" w:hAnsi="Consolas" w:cs="Consolas"/>
+          <w:sz w:val="19"/>
+          <w:szCs w:val="19"/>
+        </w:rPr>
+        <w:tab/>
+      </w:r>
+      <w:proofErr w:type="gramStart"/>
+      <w:r>
+        <w:rPr>
+          <w:rFonts w:ascii="Consolas" w:eastAsia="Consolas" w:hAnsi="Consolas" w:cs="Consolas"/>
+          <w:sz w:val="19"/>
+          <w:szCs w:val="19"/>
+        </w:rPr>
+        <w:tab/>
+        <w:t xml:space="preserve">  </w:t>
+      </w:r>
+      <w:r>
+        <w:rPr>
+          <w:rFonts w:ascii="Consolas" w:eastAsia="Consolas" w:hAnsi="Consolas" w:cs="Consolas"/>
+          <w:sz w:val="19"/>
+          <w:szCs w:val="19"/>
+        </w:rPr>
+        <w:t>←</w:t>
+      </w:r>
+      <w:proofErr w:type="gramEnd"/>
+      <w:r>
+        <w:rPr>
+          <w:rFonts w:ascii="Consolas" w:eastAsia="Consolas" w:hAnsi="Consolas" w:cs="Consolas"/>
+          <w:sz w:val="19"/>
+          <w:szCs w:val="19"/>
+        </w:rPr>
+        <w:t xml:space="preserve"> </w:t>
+      </w:r>
+      <w:r>
+        <w:rPr>
+          <w:rFonts w:ascii="Consolas" w:eastAsia="Consolas" w:hAnsi="Consolas" w:cs="Consolas"/>
+          <w:sz w:val="19"/>
+          <w:szCs w:val="19"/>
+        </w:rPr>
+        <w:t xml:space="preserve">EXAMPLE </w:t>
+      </w:r>
+      <w:proofErr w:type="gramStart"/>
+      <w:r>
+        <w:rPr>
+          <w:rFonts w:ascii="Consolas" w:eastAsia="Consolas" w:hAnsi="Consolas" w:cs="Consolas"/>
+          <w:sz w:val="19"/>
+          <w:szCs w:val="19"/>
+        </w:rPr>
+        <w:t>DATA(</w:t>
+      </w:r>
+      <w:proofErr w:type="gramEnd"/>
+      <w:r>
+        <w:rPr>
+          <w:rFonts w:ascii="Consolas" w:eastAsia="Consolas" w:hAnsi="Consolas" w:cs="Consolas"/>
+          <w:sz w:val="19"/>
+          <w:szCs w:val="19"/>
+        </w:rPr>
+        <w:t>TIFF IMAGES AND DLS)</w:t>
+      </w:r>
+    </w:p>
+    <w:p>
+      <w:pPr>
+        <w:shd w:val="clear" w:color="auto" w:fill="F2F2F2"/>
+        <w:spacing w:before="40" w:after="40"/>
+        <w:ind w:left="360"/>
+      </w:pPr>
+      <w:r>
+        <w:rPr>
+          <w:rFonts w:ascii="Consolas" w:eastAsia="Consolas" w:hAnsi="Consolas" w:cs="Consolas"/>
+          <w:sz w:val="19"/>
+          <w:szCs w:val="19"/>
+        </w:rPr>
         <w:t>├── prepare_input.py</w:t>
       </w:r>
     </w:p>
@@ -1586,7 +1729,6 @@
           <w:sz w:val="19"/>
           <w:szCs w:val="19"/>
         </w:rPr>
-        <w:lastRenderedPageBreak/>
         <w:t>├── dls_calibration.py</w:t>
       </w:r>
     </w:p>
@@ -1595,6 +1737,11 @@
         <w:shd w:val="clear" w:color="auto" w:fill="F2F2F2"/>
         <w:spacing w:before="40" w:after="40"/>
         <w:ind w:left="360"/>
+        <w:rPr>
+          <w:rFonts w:ascii="Consolas" w:eastAsia="Consolas" w:hAnsi="Consolas" w:cs="Consolas"/>
+          <w:sz w:val="19"/>
+          <w:szCs w:val="19"/>
+        </w:rPr>
       </w:pPr>
       <w:r>
         <w:rPr>
@@ -1610,6 +1757,41 @@
         <w:shd w:val="clear" w:color="auto" w:fill="F2F2F2"/>
         <w:spacing w:before="40" w:after="40"/>
         <w:ind w:left="360"/>
+        <w:rPr>
+          <w:rFonts w:ascii="Consolas" w:eastAsia="Consolas" w:hAnsi="Consolas" w:cs="Consolas"/>
+          <w:sz w:val="19"/>
+          <w:szCs w:val="19"/>
+        </w:rPr>
+      </w:pPr>
+      <w:r>
+        <w:rPr>
+          <w:rFonts w:ascii="Consolas" w:eastAsia="Consolas" w:hAnsi="Consolas" w:cs="Consolas"/>
+          <w:sz w:val="19"/>
+          <w:szCs w:val="19"/>
+        </w:rPr>
+        <w:t>├── plot_dls.py</w:t>
+      </w:r>
+    </w:p>
+    <w:p>
+      <w:pPr>
+        <w:shd w:val="clear" w:color="auto" w:fill="F2F2F2"/>
+        <w:spacing w:before="40" w:after="40"/>
+        <w:ind w:left="360"/>
+      </w:pPr>
+      <w:r>
+        <w:rPr>
+          <w:rFonts w:ascii="Consolas" w:eastAsia="Consolas" w:hAnsi="Consolas" w:cs="Consolas"/>
+          <w:sz w:val="19"/>
+          <w:szCs w:val="19"/>
+        </w:rPr>
+        <w:t>├── plot_dls_comparison.py</w:t>
+      </w:r>
+    </w:p>
+    <w:p>
+      <w:pPr>
+        <w:shd w:val="clear" w:color="auto" w:fill="F2F2F2"/>
+        <w:spacing w:before="40" w:after="40"/>
+        <w:ind w:left="360"/>
       </w:pPr>
       <w:r>
         <w:rPr>
@@ -1720,7 +1902,23 @@
           <w:bCs/>
           <w:color w:val="2B5797"/>
         </w:rPr>
-        <w:t xml:space="preserve">ℹ️ Note: </w:t>
+        <w:t>ℹ</w:t>
+      </w:r>
+      <w:r>
+        <w:rPr>
+          <w:b/>
+          <w:bCs/>
+          <w:color w:val="2B5797"/>
+        </w:rPr>
+        <w:t>️</w:t>
+      </w:r>
+      <w:r>
+        <w:rPr>
+          <w:b/>
+          <w:bCs/>
+          <w:color w:val="2B5797"/>
+        </w:rPr>
+        <w:t xml:space="preserve"> Note: </w:t>
       </w:r>
       <w:r>
         <w:rPr>
@@ -1912,6 +2110,7 @@
           <w:b/>
           <w:bCs/>
         </w:rPr>
+        <w:lastRenderedPageBreak/>
         <w:t xml:space="preserve">Windows: </w:t>
       </w:r>
       <w:r>
@@ -2008,7 +2207,6 @@
           <w:sz w:val="19"/>
           <w:szCs w:val="19"/>
         </w:rPr>
-        <w:lastRenderedPageBreak/>
         <w:t xml:space="preserve">    --output data/march_3_experiment_matlab \</w:t>
       </w:r>
     </w:p>
@@ -2176,12 +2374,6 @@
         <w:gridCol w:w="6560"/>
       </w:tblGrid>
       <w:tr>
-        <w:tblPrEx>
-          <w:tblCellMar>
-            <w:top w:w="0" w:type="dxa"/>
-            <w:bottom w:w="0" w:type="dxa"/>
-          </w:tblCellMar>
-        </w:tblPrEx>
         <w:tc>
           <w:tcPr>
             <w:tcW w:w="2800" w:type="dxa"/>
@@ -2238,12 +2430,6 @@
         </w:tc>
       </w:tr>
       <w:tr>
-        <w:tblPrEx>
-          <w:tblCellMar>
-            <w:top w:w="0" w:type="dxa"/>
-            <w:bottom w:w="0" w:type="dxa"/>
-          </w:tblCellMar>
-        </w:tblPrEx>
         <w:tc>
           <w:tcPr>
             <w:tcW w:w="2800" w:type="dxa"/>
@@ -2298,12 +2484,6 @@
         </w:tc>
       </w:tr>
       <w:tr>
-        <w:tblPrEx>
-          <w:tblCellMar>
-            <w:top w:w="0" w:type="dxa"/>
-            <w:bottom w:w="0" w:type="dxa"/>
-          </w:tblCellMar>
-        </w:tblPrEx>
         <w:tc>
           <w:tcPr>
             <w:tcW w:w="2800" w:type="dxa"/>
@@ -2358,12 +2538,6 @@
         </w:tc>
       </w:tr>
       <w:tr>
-        <w:tblPrEx>
-          <w:tblCellMar>
-            <w:top w:w="0" w:type="dxa"/>
-            <w:bottom w:w="0" w:type="dxa"/>
-          </w:tblCellMar>
-        </w:tblPrEx>
         <w:tc>
           <w:tcPr>
             <w:tcW w:w="2800" w:type="dxa"/>
@@ -2418,12 +2592,6 @@
         </w:tc>
       </w:tr>
       <w:tr>
-        <w:tblPrEx>
-          <w:tblCellMar>
-            <w:top w:w="0" w:type="dxa"/>
-            <w:bottom w:w="0" w:type="dxa"/>
-          </w:tblCellMar>
-        </w:tblPrEx>
         <w:tc>
           <w:tcPr>
             <w:tcW w:w="2800" w:type="dxa"/>
@@ -2657,6 +2825,7 @@
           <w:b/>
           <w:bCs/>
         </w:rPr>
+        <w:lastRenderedPageBreak/>
         <w:t xml:space="preserve">What this does: </w:t>
       </w:r>
       <w:r>
@@ -2778,7 +2947,7 @@
     </w:p>
     <w:p>
       <w:pPr>
-        <w:spacing w:after="120" w:before="0"/>
+        <w:spacing w:after="120"/>
         <w:ind w:left="360"/>
       </w:pPr>
       <w:r>
@@ -2837,21 +3006,21 @@
       <w:r>
         <w:rPr>
           <w:rFonts w:ascii="Consolas" w:eastAsia="Consolas" w:hAnsi="Consolas" w:cs="Consolas"/>
+          <w:color w:val="555555"/>
           <w:sz w:val="20"/>
           <w:szCs w:val="20"/>
+        </w:rPr>
+        <w:t>texasred</w:t>
+      </w:r>
+      <w:r>
+        <w:t xml:space="preserve"> for Texas Red dye, and </w:t>
+      </w:r>
+      <w:r>
+        <w:rPr>
+          <w:rFonts w:ascii="Consolas" w:eastAsia="Consolas" w:hAnsi="Consolas" w:cs="Consolas"/>
           <w:color w:val="555555"/>
-        </w:rPr>
-        <w:t>texasred</w:t>
-      </w:r>
-      <w:r>
-        <w:t xml:space="preserve"> for Texas Red dye, and </w:t>
-      </w:r>
-      <w:r>
-        <w:rPr>
-          <w:rFonts w:ascii="Consolas" w:eastAsia="Consolas" w:hAnsi="Consolas" w:cs="Consolas"/>
           <w:sz w:val="20"/>
           <w:szCs w:val="20"/>
-          <w:color w:val="555555"/>
         </w:rPr>
         <w:t>egfp</w:t>
       </w:r>
@@ -2968,9 +3137,9 @@
       <w:r>
         <w:rPr>
           <w:rFonts w:ascii="Consolas" w:eastAsia="Consolas" w:hAnsi="Consolas" w:cs="Consolas"/>
+          <w:color w:val="555555"/>
           <w:sz w:val="20"/>
           <w:szCs w:val="20"/>
-          <w:color w:val="555555"/>
         </w:rPr>
         <w:t>sigma_value</w:t>
       </w:r>
@@ -3013,6 +3182,7 @@
         <w:spacing w:after="120"/>
       </w:pPr>
       <w:r>
+        <w:lastRenderedPageBreak/>
         <w:t>When it’s done, verify that the master channel (ch1) now has a Detection subfolder. Note that only the master/lipid channel gets the Detection folder — ch2 will just have the TIFF file:</w:t>
       </w:r>
     </w:p>
@@ -3137,8 +3307,16 @@
           <w:bCs/>
           <w:color w:val="2B5797"/>
         </w:rPr>
-        <w:lastRenderedPageBreak/>
-        <w:t>ℹ️</w:t>
+        <w:t>ℹ</w:t>
+      </w:r>
+      <w:r>
+        <w:rPr>
+          <w:rFonts w:ascii="Segoe UI Emoji" w:hAnsi="Segoe UI Emoji" w:cs="Segoe UI Emoji"/>
+          <w:b/>
+          <w:bCs/>
+          <w:color w:val="2B5797"/>
+        </w:rPr>
+        <w:t>️</w:t>
       </w:r>
       <w:r>
         <w:rPr>
@@ -3451,12 +3629,6 @@
         <w:gridCol w:w="6560"/>
       </w:tblGrid>
       <w:tr>
-        <w:tblPrEx>
-          <w:tblCellMar>
-            <w:top w:w="0" w:type="dxa"/>
-            <w:bottom w:w="0" w:type="dxa"/>
-          </w:tblCellMar>
-        </w:tblPrEx>
         <w:tc>
           <w:tcPr>
             <w:tcW w:w="2800" w:type="dxa"/>
@@ -3513,12 +3685,6 @@
         </w:tc>
       </w:tr>
       <w:tr>
-        <w:tblPrEx>
-          <w:tblCellMar>
-            <w:top w:w="0" w:type="dxa"/>
-            <w:bottom w:w="0" w:type="dxa"/>
-          </w:tblCellMar>
-        </w:tblPrEx>
         <w:tc>
           <w:tcPr>
             <w:tcW w:w="2800" w:type="dxa"/>
@@ -3573,12 +3739,6 @@
         </w:tc>
       </w:tr>
       <w:tr>
-        <w:tblPrEx>
-          <w:tblCellMar>
-            <w:top w:w="0" w:type="dxa"/>
-            <w:bottom w:w="0" w:type="dxa"/>
-          </w:tblCellMar>
-        </w:tblPrEx>
         <w:tc>
           <w:tcPr>
             <w:tcW w:w="2800" w:type="dxa"/>
@@ -3633,12 +3793,6 @@
         </w:tc>
       </w:tr>
       <w:tr>
-        <w:tblPrEx>
-          <w:tblCellMar>
-            <w:top w:w="0" w:type="dxa"/>
-            <w:bottom w:w="0" w:type="dxa"/>
-          </w:tblCellMar>
-        </w:tblPrEx>
         <w:tc>
           <w:tcPr>
             <w:tcW w:w="2800" w:type="dxa"/>
@@ -3693,12 +3847,6 @@
         </w:tc>
       </w:tr>
       <w:tr>
-        <w:tblPrEx>
-          <w:tblCellMar>
-            <w:top w:w="0" w:type="dxa"/>
-            <w:bottom w:w="0" w:type="dxa"/>
-          </w:tblCellMar>
-        </w:tblPrEx>
         <w:tc>
           <w:tcPr>
             <w:tcW w:w="2800" w:type="dxa"/>
@@ -3722,6 +3870,7 @@
                 <w:sz w:val="20"/>
                 <w:szCs w:val="20"/>
               </w:rPr>
+              <w:lastRenderedPageBreak/>
               <w:t>--k-std</w:t>
             </w:r>
           </w:p>
@@ -3753,12 +3902,6 @@
         </w:tc>
       </w:tr>
       <w:tr>
-        <w:tblPrEx>
-          <w:tblCellMar>
-            <w:top w:w="0" w:type="dxa"/>
-            <w:bottom w:w="0" w:type="dxa"/>
-          </w:tblCellMar>
-        </w:tblPrEx>
         <w:tc>
           <w:tcPr>
             <w:tcW w:w="2800" w:type="dxa"/>
@@ -3858,7 +4001,6 @@
         <w:spacing w:after="120"/>
       </w:pPr>
       <w:r>
-        <w:lastRenderedPageBreak/>
         <w:t xml:space="preserve">This file has columns: </w:t>
       </w:r>
       <w:r>
@@ -4244,12 +4386,6 @@
         <w:gridCol w:w="6560"/>
       </w:tblGrid>
       <w:tr>
-        <w:tblPrEx>
-          <w:tblCellMar>
-            <w:top w:w="0" w:type="dxa"/>
-            <w:bottom w:w="0" w:type="dxa"/>
-          </w:tblCellMar>
-        </w:tblPrEx>
         <w:tc>
           <w:tcPr>
             <w:tcW w:w="2800" w:type="dxa"/>
@@ -4273,6 +4409,7 @@
                 <w:b/>
                 <w:bCs/>
               </w:rPr>
+              <w:lastRenderedPageBreak/>
               <w:t>Argument</w:t>
             </w:r>
           </w:p>
@@ -4306,12 +4443,6 @@
         </w:tc>
       </w:tr>
       <w:tr>
-        <w:tblPrEx>
-          <w:tblCellMar>
-            <w:top w:w="0" w:type="dxa"/>
-            <w:bottom w:w="0" w:type="dxa"/>
-          </w:tblCellMar>
-        </w:tblPrEx>
         <w:tc>
           <w:tcPr>
             <w:tcW w:w="2800" w:type="dxa"/>
@@ -4366,12 +4497,6 @@
         </w:tc>
       </w:tr>
       <w:tr>
-        <w:tblPrEx>
-          <w:tblCellMar>
-            <w:top w:w="0" w:type="dxa"/>
-            <w:bottom w:w="0" w:type="dxa"/>
-          </w:tblCellMar>
-        </w:tblPrEx>
         <w:tc>
           <w:tcPr>
             <w:tcW w:w="2800" w:type="dxa"/>
@@ -4395,7 +4520,15 @@
                 <w:sz w:val="20"/>
                 <w:szCs w:val="20"/>
               </w:rPr>
-              <w:t>--dls-mean-diameter</w:t>
+              <w:t>--</w:t>
+            </w:r>
+            <w:r>
+              <w:rPr>
+                <w:rFonts w:ascii="Consolas" w:eastAsia="Consolas" w:hAnsi="Consolas" w:cs="Consolas"/>
+                <w:sz w:val="20"/>
+                <w:szCs w:val="20"/>
+              </w:rPr>
+              <w:t>conversion-factor</w:t>
             </w:r>
           </w:p>
         </w:tc>
@@ -4426,12 +4559,6 @@
         </w:tc>
       </w:tr>
       <w:tr>
-        <w:tblPrEx>
-          <w:tblCellMar>
-            <w:top w:w="0" w:type="dxa"/>
-            <w:bottom w:w="0" w:type="dxa"/>
-          </w:tblCellMar>
-        </w:tblPrEx>
         <w:tc>
           <w:tcPr>
             <w:tcW w:w="2800" w:type="dxa"/>
@@ -4486,12 +4613,6 @@
         </w:tc>
       </w:tr>
       <w:tr>
-        <w:tblPrEx>
-          <w:tblCellMar>
-            <w:top w:w="0" w:type="dxa"/>
-            <w:bottom w:w="0" w:type="dxa"/>
-          </w:tblCellMar>
-        </w:tblPrEx>
         <w:tc>
           <w:tcPr>
             <w:tcW w:w="2800" w:type="dxa"/>
@@ -4546,12 +4667,6 @@
         </w:tc>
       </w:tr>
       <w:tr>
-        <w:tblPrEx>
-          <w:tblCellMar>
-            <w:top w:w="0" w:type="dxa"/>
-            <w:bottom w:w="0" w:type="dxa"/>
-          </w:tblCellMar>
-        </w:tblPrEx>
         <w:tc>
           <w:tcPr>
             <w:tcW w:w="2800" w:type="dxa"/>
@@ -4606,12 +4721,6 @@
         </w:tc>
       </w:tr>
       <w:tr>
-        <w:tblPrEx>
-          <w:tblCellMar>
-            <w:top w:w="0" w:type="dxa"/>
-            <w:bottom w:w="0" w:type="dxa"/>
-          </w:tblCellMar>
-        </w:tblPrEx>
         <w:tc>
           <w:tcPr>
             <w:tcW w:w="2800" w:type="dxa"/>
@@ -4635,7 +4744,6 @@
                 <w:sz w:val="20"/>
                 <w:szCs w:val="20"/>
               </w:rPr>
-              <w:lastRenderedPageBreak/>
               <w:t>--save-dir</w:t>
             </w:r>
           </w:p>
@@ -4795,7 +4903,23 @@
           <w:bCs/>
           <w:color w:val="2B5797"/>
         </w:rPr>
-        <w:t xml:space="preserve">ℹ️ Note: </w:t>
+        <w:t>ℹ</w:t>
+      </w:r>
+      <w:r>
+        <w:rPr>
+          <w:b/>
+          <w:bCs/>
+          <w:color w:val="2B5797"/>
+        </w:rPr>
+        <w:t>️</w:t>
+      </w:r>
+      <w:r>
+        <w:rPr>
+          <w:b/>
+          <w:bCs/>
+          <w:color w:val="2B5797"/>
+        </w:rPr>
+        <w:t xml:space="preserve"> Note: </w:t>
       </w:r>
       <w:r>
         <w:rPr>
@@ -4923,6 +5047,7 @@
           <w:b/>
           <w:bCs/>
         </w:rPr>
+        <w:lastRenderedPageBreak/>
         <w:t>Binned average goes UP toward smaller radii</w:t>
       </w:r>
       <w:r>
@@ -5136,7 +5261,7 @@
           <w:sz w:val="19"/>
           <w:szCs w:val="19"/>
         </w:rPr>
-        <w:t xml:space="preserve">python plot_histograms.py `</w:t>
+        <w:t>python plot_histograms.py `</w:t>
       </w:r>
     </w:p>
     <w:p>
@@ -5338,7 +5463,7 @@
           <w:sz w:val="19"/>
           <w:szCs w:val="19"/>
         </w:rPr>
-        <w:t xml:space="preserve">python plot_histograms.py `</w:t>
+        <w:t>python plot_histograms.py `</w:t>
       </w:r>
     </w:p>
     <w:p>
@@ -5415,6 +5540,7 @@
           <w:b/>
           <w:bCs/>
         </w:rPr>
+        <w:lastRenderedPageBreak/>
         <w:t xml:space="preserve">To view log-transformed amplitudes </w:t>
       </w:r>
       <w:r>
@@ -5423,523 +5549,980 @@
       <w:r>
         <w:rPr>
           <w:rFonts w:ascii="Consolas" w:eastAsia="Consolas" w:hAnsi="Consolas" w:cs="Consolas"/>
+          <w:color w:val="555555"/>
           <w:sz w:val="20"/>
           <w:szCs w:val="20"/>
+        </w:rPr>
+        <w:t>--transform log_sqrt</w:t>
+      </w:r>
+      <w:r>
+        <w:t xml:space="preserve"> to any of the above commands. Options are </w:t>
+      </w:r>
+      <w:r>
+        <w:rPr>
+          <w:rFonts w:ascii="Consolas" w:eastAsia="Consolas" w:hAnsi="Consolas" w:cs="Consolas"/>
           <w:color w:val="555555"/>
-        </w:rPr>
-        <w:t>--transform log_sqrt</w:t>
-      </w:r>
-      <w:r>
-        <w:t xml:space="preserve"> to any of the above commands. Options are </w:t>
-      </w:r>
-      <w:r>
-        <w:rPr>
-          <w:rFonts w:ascii="Consolas" w:eastAsia="Consolas" w:hAnsi="Consolas" w:cs="Consolas"/>
           <w:sz w:val="20"/>
           <w:szCs w:val="20"/>
+        </w:rPr>
+        <w:t>raw</w:t>
+      </w:r>
+      <w:r>
+        <w:t xml:space="preserve"> (default), </w:t>
+      </w:r>
+      <w:r>
+        <w:rPr>
+          <w:rFonts w:ascii="Consolas" w:eastAsia="Consolas" w:hAnsi="Consolas" w:cs="Consolas"/>
           <w:color w:val="555555"/>
-        </w:rPr>
-        <w:t>raw</w:t>
-      </w:r>
-      <w:r>
-        <w:t xml:space="preserve"> (default), </w:t>
-      </w:r>
-      <w:r>
-        <w:rPr>
-          <w:rFonts w:ascii="Consolas" w:eastAsia="Consolas" w:hAnsi="Consolas" w:cs="Consolas"/>
           <w:sz w:val="20"/>
           <w:szCs w:val="20"/>
+        </w:rPr>
+        <w:t>sqrt</w:t>
+      </w:r>
+      <w:r>
+        <w:t xml:space="preserve">, or </w:t>
+      </w:r>
+      <w:r>
+        <w:rPr>
+          <w:rFonts w:ascii="Consolas" w:eastAsia="Consolas" w:hAnsi="Consolas" w:cs="Consolas"/>
           <w:color w:val="555555"/>
-        </w:rPr>
-        <w:t>sqrt</w:t>
-      </w:r>
-      <w:r>
-        <w:t xml:space="preserve">, or </w:t>
-      </w:r>
-      <w:r>
-        <w:rPr>
-          <w:rFonts w:ascii="Consolas" w:eastAsia="Consolas" w:hAnsi="Consolas" w:cs="Consolas"/>
           <w:sz w:val="20"/>
           <w:szCs w:val="20"/>
+        </w:rPr>
+        <w:t>log_sqrt</w:t>
+      </w:r>
+      <w:r>
+        <w:t>.</w:t>
+      </w:r>
+    </w:p>
+    <w:p>
+      <w:pPr>
+        <w:spacing w:after="60"/>
+      </w:pPr>
+    </w:p>
+    <w:p>
+      <w:pPr>
+        <w:spacing w:after="120"/>
+      </w:pPr>
+      <w:r>
+        <w:rPr>
+          <w:b/>
+          <w:bCs/>
+        </w:rPr>
+        <w:t xml:space="preserve">What it produces: </w:t>
+      </w:r>
+      <w:r>
+        <w:t xml:space="preserve">Amplitude histograms for each channel (with mean/median lines), a protein amplitude histogram (if protein column provided), and an estimated diameter distribution calibrated against your DLS data (if </w:t>
+      </w:r>
+      <w:r>
+        <w:rPr>
+          <w:rFonts w:ascii="Consolas" w:eastAsia="Consolas" w:hAnsi="Consolas" w:cs="Consolas"/>
           <w:color w:val="555555"/>
-        </w:rPr>
-        <w:t>log_sqrt</w:t>
-      </w:r>
-      <w:r>
-        <w:t>.</w:t>
-      </w:r>
-    </w:p>
-    <w:p>
-      <w:pPr>
-        <w:spacing w:after="60"/>
-      </w:pPr>
-    </w:p>
-    <w:p>
-      <w:pPr>
-        <w:spacing w:after="120"/>
-      </w:pPr>
-      <w:r>
-        <w:rPr>
-          <w:b/>
-          <w:bCs/>
-        </w:rPr>
-        <w:t xml:space="preserve">What it produces: </w:t>
-      </w:r>
-      <w:r>
-        <w:t xml:space="preserve">Amplitude histograms for each channel (with mean/median lines), a protein amplitude histogram (if protein column provided), and an estimated diameter distribution calibrated against your DLS data (if </w:t>
-      </w:r>
-      <w:r>
-        <w:rPr>
-          <w:rFonts w:ascii="Consolas" w:eastAsia="Consolas" w:hAnsi="Consolas" w:cs="Consolas"/>
           <w:sz w:val="20"/>
           <w:szCs w:val="20"/>
+        </w:rPr>
+        <w:t>--conversion-factor</w:t>
+      </w:r>
+      <w:r>
+        <w:t xml:space="preserve"> is provided). The diameter distribution is especially useful — if it looks nothing like your DLS, something is off with the calibration or filtering.</w:t>
+      </w:r>
+    </w:p>
+    <w:p>
+      <w:pPr>
+        <w:pStyle w:val="Heading1"/>
+      </w:pPr>
+      <w:r>
+        <w:t>Optional: DLS Calibration Script</w:t>
+      </w:r>
+    </w:p>
+    <w:p>
+      <w:pPr>
+        <w:spacing w:after="120"/>
+      </w:pPr>
+      <w:r>
+        <w:t xml:space="preserve">The script fits log-normal distributions to both the DLS intensity distribution and the fluorescence sqrt(A) distribution simultaneously. It outputs conversion factors that map sqrt(amplitude) to physical diameter in nm. It also computes a simple ratio-of-means conversion for comparison. It uses the </w:t>
+      </w:r>
+      <w:r>
+        <w:rPr>
+          <w:b/>
+          <w:bCs/>
+        </w:rPr>
+        <w:t>Intensity</w:t>
+      </w:r>
+      <w:r>
+        <w:t xml:space="preserve"> distribution. The ratio-of-means conversion uses the </w:t>
+      </w:r>
+      <w:r>
+        <w:rPr>
+          <w:b/>
+          <w:bCs/>
+        </w:rPr>
+        <w:t xml:space="preserve">number </w:t>
+      </w:r>
+      <w:r>
+        <w:t>distribution. See the example data to see how the DLS data should be formatted in the spreadsheet.</w:t>
+      </w:r>
+    </w:p>
+    <w:p>
+      <w:pPr>
+        <w:spacing w:after="60"/>
+      </w:pPr>
+    </w:p>
+    <w:p>
+      <w:pPr>
+        <w:spacing w:after="120"/>
+      </w:pPr>
+      <w:r>
+        <w:rPr>
+          <w:b/>
+          <w:bCs/>
+        </w:rPr>
+        <w:t>macOS/Linux:</w:t>
+      </w:r>
+    </w:p>
+    <w:p>
+      <w:pPr>
+        <w:shd w:val="clear" w:color="auto" w:fill="F2F2F2"/>
+        <w:spacing w:before="40" w:after="40"/>
+        <w:ind w:left="360"/>
+      </w:pPr>
+      <w:r>
+        <w:rPr>
+          <w:rFonts w:ascii="Consolas" w:eastAsia="Consolas" w:hAnsi="Consolas" w:cs="Consolas"/>
+          <w:sz w:val="19"/>
+          <w:szCs w:val="19"/>
+        </w:rPr>
+        <w:t>python dls_calibration.py --dls-input data/dls_data.xlsx --fluor-input data/.../filtered_puncta_A_values.txt --z-avg 131.0 --pdi 0.08 --save-dir figures/</w:t>
+      </w:r>
+    </w:p>
+    <w:p>
+      <w:pPr>
+        <w:spacing w:after="60"/>
+      </w:pPr>
+    </w:p>
+    <w:p>
+      <w:pPr>
+        <w:spacing w:after="120"/>
+      </w:pPr>
+      <w:r>
+        <w:rPr>
+          <w:b/>
+          <w:bCs/>
+        </w:rPr>
+        <w:t>Windows PowerShell:</w:t>
+      </w:r>
+    </w:p>
+    <w:p>
+      <w:pPr>
+        <w:shd w:val="clear" w:color="auto" w:fill="F2F2F2"/>
+        <w:spacing w:before="40" w:after="40"/>
+        <w:ind w:left="360"/>
+      </w:pPr>
+      <w:r>
+        <w:rPr>
+          <w:rFonts w:ascii="Consolas" w:eastAsia="Consolas" w:hAnsi="Consolas" w:cs="Consolas"/>
+          <w:sz w:val="19"/>
+          <w:szCs w:val="19"/>
+        </w:rPr>
+        <w:t>python dls_calibration.py --dls-input data\dls_data.xlsx --fluor-input data\...\filtered_puncta_A_values.txt --z-avg 131.0 --pdi 0.08 --save-dir figures/</w:t>
+      </w:r>
+    </w:p>
+    <w:p>
+      <w:pPr>
+        <w:spacing w:after="60"/>
+      </w:pPr>
+    </w:p>
+    <w:p>
+      <w:pPr>
+        <w:spacing w:after="120"/>
+      </w:pPr>
+      <w:r>
+        <w:t xml:space="preserve">The </w:t>
+      </w:r>
+      <w:r>
+        <w:rPr>
+          <w:rFonts w:ascii="Consolas" w:eastAsia="Consolas" w:hAnsi="Consolas" w:cs="Consolas"/>
           <w:color w:val="555555"/>
-        </w:rPr>
-        <w:t>--conversion-factor</w:t>
-      </w:r>
-      <w:r>
-        <w:t xml:space="preserve"> is provided). The diameter distribution is especially useful — if it looks nothing like your DLS, something is off with the calibration or filtering.</w:t>
-      </w:r>
-    </w:p>
-    <w:p>
-      <w:pPr>
-        <w:pStyle w:val="Heading1"/>
-      </w:pPr>
-      <w:r>
-        <w:t>Optional: DLS Calibration Script</w:t>
-      </w:r>
-    </w:p>
-    <w:p>
-      <w:pPr>
-        <w:spacing w:after="120"/>
-      </w:pPr>
-      <w:r>
-        <w:t xml:space="preserve">The script fits log-normal distributions to both the DLS intensity distribution and the fluorescence sqrt(A) distribution simultaneously. It outputs conversion factors that map sqrt(amplitude) to physical diameter in nm. It also computes a simple ratio-of-means conversion for comparison. It uses the </w:t>
-      </w:r>
-      <w:r>
-        <w:rPr>
-          <w:b/>
-          <w:bCs/>
-        </w:rPr>
-        <w:t>Intensity</w:t>
-      </w:r>
-      <w:r>
-        <w:t xml:space="preserve"> distribution.</w:t>
-      </w:r>
-    </w:p>
-    <w:p>
-      <w:pPr>
-        <w:spacing w:after="60"/>
-      </w:pPr>
-    </w:p>
-    <w:p>
-      <w:pPr>
-        <w:spacing w:after="120"/>
-      </w:pPr>
-      <w:r>
-        <w:rPr>
-          <w:b/>
-          <w:bCs/>
-        </w:rPr>
-        <w:t>macOS/Linux:</w:t>
-      </w:r>
-    </w:p>
-    <w:p>
-      <w:pPr>
-        <w:shd w:val="clear" w:color="auto" w:fill="F2F2F2"/>
-        <w:spacing w:before="40" w:after="40"/>
-        <w:ind w:left="360"/>
-      </w:pPr>
-      <w:r>
-        <w:rPr>
-          <w:rFonts w:ascii="Consolas" w:eastAsia="Consolas" w:hAnsi="Consolas" w:cs="Consolas"/>
-          <w:sz w:val="19"/>
-          <w:szCs w:val="19"/>
-        </w:rPr>
-        <w:t>python dls_calibration.py --dls-input data/dls_data.xlsx --fluor-input data/.../filtered_puncta_A_values.txt --z-avg 131.0 --pdi 0.08 --save-dir figures/</w:t>
-      </w:r>
-    </w:p>
-    <w:p>
-      <w:pPr>
-        <w:spacing w:after="60"/>
-      </w:pPr>
-    </w:p>
-    <w:p>
-      <w:pPr>
-        <w:spacing w:after="120"/>
-      </w:pPr>
-      <w:r>
-        <w:rPr>
-          <w:b/>
-          <w:bCs/>
-        </w:rPr>
-        <w:t>Windows PowerShell:</w:t>
-      </w:r>
-    </w:p>
-    <w:p>
-      <w:pPr>
-        <w:shd w:val="clear" w:color="auto" w:fill="F2F2F2"/>
-        <w:spacing w:before="40" w:after="40"/>
-        <w:ind w:left="360"/>
-      </w:pPr>
-      <w:r>
-        <w:rPr>
-          <w:rFonts w:ascii="Consolas" w:eastAsia="Consolas" w:hAnsi="Consolas" w:cs="Consolas"/>
-          <w:sz w:val="19"/>
-          <w:szCs w:val="19"/>
-        </w:rPr>
-        <w:t>python dls_calibration.py --dls-input data\dls_data.xlsx --fluor-input data\...\filtered_puncta_A_values.txt --z-avg 131.0 --pdi 0.08 --save-dir figures/</w:t>
-      </w:r>
-    </w:p>
-    <w:p>
-      <w:pPr>
-        <w:spacing w:after="60"/>
-      </w:pPr>
-    </w:p>
-    <w:p>
-      <w:pPr>
-        <w:spacing w:after="120"/>
-      </w:pPr>
-      <w:r>
-        <w:t xml:space="preserve">To use a different distribution type, add </w:t>
-      </w:r>
-      <w:r>
-        <w:rPr>
-          <w:rFonts w:ascii="Consolas" w:eastAsia="Consolas" w:hAnsi="Consolas" w:cs="Consolas"/>
           <w:sz w:val="20"/>
           <w:szCs w:val="20"/>
+        </w:rPr>
+        <w:t>–z-</w:t>
+      </w:r>
+      <w:proofErr w:type="gramStart"/>
+      <w:r>
+        <w:rPr>
+          <w:rFonts w:ascii="Consolas" w:eastAsia="Consolas" w:hAnsi="Consolas" w:cs="Consolas"/>
           <w:color w:val="555555"/>
-        </w:rPr>
-        <w:t>--distribution intensity</w:t>
-      </w:r>
-      <w:r>
-        <w:t xml:space="preserve"> or </w:t>
-      </w:r>
-      <w:r>
-        <w:rPr>
-          <w:rFonts w:ascii="Consolas" w:eastAsia="Consolas" w:hAnsi="Consolas" w:cs="Consolas"/>
           <w:sz w:val="20"/>
           <w:szCs w:val="20"/>
+        </w:rPr>
+        <w:t>avg</w:t>
+      </w:r>
+      <w:r>
+        <w:t xml:space="preserve">  and</w:t>
+      </w:r>
+      <w:proofErr w:type="gramEnd"/>
+      <w:r>
+        <w:t xml:space="preserve"> </w:t>
+      </w:r>
+      <w:r>
+        <w:rPr>
+          <w:rFonts w:ascii="Consolas" w:eastAsia="Consolas" w:hAnsi="Consolas" w:cs="Consolas"/>
           <w:color w:val="555555"/>
-        </w:rPr>
-        <w:t>--distribution volume</w:t>
-      </w:r>
-      <w:r>
-        <w:t>.</w:t>
-      </w:r>
-    </w:p>
-    <w:p>
-      <w:pPr>
-        <w:spacing w:after="60"/>
-      </w:pPr>
-    </w:p>
-    <w:p>
-      <w:pPr>
-        <w:spacing w:after="120"/>
-      </w:pPr>
-      <w:r>
-        <w:t xml:space="preserve">It will print three conversion factors and show how to use each. Use the log-normal conversion factor with --conversion-factor, or the ratio-of-means diameter with --dls-mean-diameter, in Steps 4a and 4b.</w:t>
-      </w:r>
-    </w:p>
-    <w:p>
-      <w:pPr>
-        <w:spacing w:after="60"/>
-      </w:pPr>
-    </w:p>
-    <w:p>
-      <w:pPr>
-        <w:spacing w:after="120"/>
-      </w:pPr>
-      <w:r>
-        <w:rPr>
-          <w:b/>
-          <w:bCs/>
-          <w:color w:val="2B5797"/>
-        </w:rPr>
-        <w:t xml:space="preserve">ℹ️ Note: </w:t>
-      </w:r>
-      <w:r>
-        <w:rPr>
-          <w:color w:val="555555"/>
-        </w:rPr>
-        <w:t>The DLS spreadsheet must include the intensity distribution (for log-normal fitting) and the number distribution (for ratio-of-means). Export the size distribution from the Zetasizer software and copy it into an Excel file with the standard section headers (“X Intensity”, “X Volume”, “X Number”). You also need the Z-average and PDI from the Zetasizer cumulants summary report.</w:t>
-      </w:r>
-    </w:p>
-    <w:p>
-      <w:pPr>
-        <w:pStyle w:val="Heading1"/>
-      </w:pPr>
-      <w:r>
-        <w:t>Optional: Normalized Overlay Across Experiments</w:t>
-      </w:r>
-    </w:p>
-    <w:p>
-      <w:pPr>
-        <w:spacing w:after="120"/>
-      </w:pPr>
-      <w:r>
-        <w:t xml:space="preserve">If you have multiple experiments (different proteins, conditions, or replicates) and want to compare their curvature sorting on a single plot, use the overlay script. It normalizes each curve so the largest-radius bin equals 1, then overlays just the binned averages. The y-axis shows fold-enrichment at high curvature relative to flat membranes.</w:t>
-      </w:r>
-    </w:p>
-    <w:p>
-      <w:pPr>
-        <w:spacing w:after="60"/>
-      </w:pPr>
-    </w:p>
-    <w:p>
-      <w:pPr>
-        <w:spacing w:after="120"/>
-      </w:pPr>
-      <w:r>
-        <w:rPr>
-          <w:b/>
-          <w:bCs/>
-        </w:rPr>
-        <w:t xml:space="preserve">Key detail: </w:t>
-      </w:r>
-      <w:r>
-        <w:t xml:space="preserve">Each input file gets its own conversion factor (from dls_calibration.py), specified with a colon after the filepath. This is important because different liposome stocks may have different size distributions.</w:t>
-      </w:r>
-    </w:p>
-    <w:p>
-      <w:pPr>
-        <w:spacing w:after="60"/>
-      </w:pPr>
-    </w:p>
-    <w:p>
-      <w:pPr>
-        <w:spacing w:after="120"/>
-      </w:pPr>
-      <w:r>
-        <w:rPr>
-          <w:b/>
-          <w:bCs/>
-        </w:rPr>
-        <w:t>macOS/Linux:</w:t>
-      </w:r>
-    </w:p>
-    <w:p>
-      <w:pPr>
-        <w:shd w:val="clear" w:color="auto" w:fill="F2F2F2"/>
-        <w:spacing w:before="40" w:after="40"/>
-        <w:ind w:left="360"/>
-      </w:pPr>
-      <w:r>
-        <w:rPr>
-          <w:rFonts w:ascii="Consolas" w:eastAsia="Consolas" w:hAnsi="Consolas" w:cs="Consolas"/>
-          <w:sz w:val="19"/>
-          <w:szCs w:val="19"/>
-        </w:rPr>
-        <w:t>python plot_overlay.py \</w:t>
-      </w:r>
-    </w:p>
-    <w:p>
-      <w:pPr>
-        <w:shd w:val="clear" w:color="auto" w:fill="F2F2F2"/>
-        <w:spacing w:before="40" w:after="40"/>
-        <w:ind w:left="360"/>
-      </w:pPr>
-      <w:r>
-        <w:rPr>
-          <w:rFonts w:ascii="Consolas" w:eastAsia="Consolas" w:hAnsi="Consolas" w:cs="Consolas"/>
-          <w:sz w:val="19"/>
-          <w:szCs w:val="19"/>
-        </w:rPr>
-        <w:t xml:space="preserve">    --input data/cond1/filtered_puncta_A_values.txt:1.234 \</w:t>
-      </w:r>
-    </w:p>
-    <w:p>
-      <w:pPr>
-        <w:shd w:val="clear" w:color="auto" w:fill="F2F2F2"/>
-        <w:spacing w:before="40" w:after="40"/>
-        <w:ind w:left="360"/>
-      </w:pPr>
-      <w:r>
-        <w:rPr>
-          <w:rFonts w:ascii="Consolas" w:eastAsia="Consolas" w:hAnsi="Consolas" w:cs="Consolas"/>
-          <w:sz w:val="19"/>
-          <w:szCs w:val="19"/>
-        </w:rPr>
-        <w:t xml:space="preserve">           data/cond2/filtered_puncta_A_values.txt:1.567 \</w:t>
-      </w:r>
-    </w:p>
-    <w:p>
-      <w:pPr>
-        <w:shd w:val="clear" w:color="auto" w:fill="F2F2F2"/>
-        <w:spacing w:before="40" w:after="40"/>
-        <w:ind w:left="360"/>
-      </w:pPr>
-      <w:r>
-        <w:rPr>
-          <w:rFonts w:ascii="Consolas" w:eastAsia="Consolas" w:hAnsi="Consolas" w:cs="Consolas"/>
-          <w:sz w:val="19"/>
-          <w:szCs w:val="19"/>
-        </w:rPr>
-        <w:t xml:space="preserve">    --labels "WT protein" "Mutant K58A" \</w:t>
-      </w:r>
-    </w:p>
-    <w:p>
-      <w:pPr>
-        <w:shd w:val="clear" w:color="auto" w:fill="F2F2F2"/>
-        <w:spacing w:before="40" w:after="40"/>
-        <w:ind w:left="360"/>
-      </w:pPr>
-      <w:r>
-        <w:rPr>
-          <w:rFonts w:ascii="Consolas" w:eastAsia="Consolas" w:hAnsi="Consolas" w:cs="Consolas"/>
-          <w:sz w:val="19"/>
-          <w:szCs w:val="19"/>
-        </w:rPr>
-        <w:t xml:space="preserve">    --save-dir figures/</w:t>
-      </w:r>
-    </w:p>
-    <w:p>
-      <w:pPr>
-        <w:spacing w:after="60"/>
-      </w:pPr>
-    </w:p>
-    <w:p>
-      <w:pPr>
-        <w:spacing w:after="120"/>
-      </w:pPr>
-      <w:r>
-        <w:rPr>
-          <w:b/>
-          <w:bCs/>
-        </w:rPr>
-        <w:t>Windows PowerShell:</w:t>
-      </w:r>
-    </w:p>
-    <w:p>
-      <w:pPr>
-        <w:shd w:val="clear" w:color="auto" w:fill="F2F2F2"/>
-        <w:spacing w:before="40" w:after="40"/>
-        <w:ind w:left="360"/>
-      </w:pPr>
-      <w:r>
-        <w:rPr>
-          <w:rFonts w:ascii="Consolas" w:eastAsia="Consolas" w:hAnsi="Consolas" w:cs="Consolas"/>
-          <w:sz w:val="19"/>
-          <w:szCs w:val="19"/>
-        </w:rPr>
-        <w:t>python plot_overlay.py `</w:t>
-      </w:r>
-    </w:p>
-    <w:p>
-      <w:pPr>
-        <w:shd w:val="clear" w:color="auto" w:fill="F2F2F2"/>
-        <w:spacing w:before="40" w:after="40"/>
-        <w:ind w:left="360"/>
-      </w:pPr>
-      <w:r>
-        <w:rPr>
-          <w:rFonts w:ascii="Consolas" w:eastAsia="Consolas" w:hAnsi="Consolas" w:cs="Consolas"/>
-          <w:sz w:val="19"/>
-          <w:szCs w:val="19"/>
-        </w:rPr>
-        <w:t xml:space="preserve">    --input data\cond1\filtered_puncta_A_values.txt:1.234 `</w:t>
-      </w:r>
-    </w:p>
-    <w:p>
-      <w:pPr>
-        <w:shd w:val="clear" w:color="auto" w:fill="F2F2F2"/>
-        <w:spacing w:before="40" w:after="40"/>
-        <w:ind w:left="360"/>
-      </w:pPr>
-      <w:r>
-        <w:rPr>
-          <w:rFonts w:ascii="Consolas" w:eastAsia="Consolas" w:hAnsi="Consolas" w:cs="Consolas"/>
-          <w:sz w:val="19"/>
-          <w:szCs w:val="19"/>
-        </w:rPr>
-        <w:t xml:space="preserve">           data\cond2\filtered_puncta_A_values.txt:1.567 `</w:t>
-      </w:r>
-    </w:p>
-    <w:p>
-      <w:pPr>
-        <w:shd w:val="clear" w:color="auto" w:fill="F2F2F2"/>
-        <w:spacing w:before="40" w:after="40"/>
-        <w:ind w:left="360"/>
-      </w:pPr>
-      <w:r>
-        <w:rPr>
-          <w:rFonts w:ascii="Consolas" w:eastAsia="Consolas" w:hAnsi="Consolas" w:cs="Consolas"/>
-          <w:sz w:val="19"/>
-          <w:szCs w:val="19"/>
-        </w:rPr>
-        <w:t xml:space="preserve">    --labels "WT protein" "Mutant K58A" `</w:t>
-      </w:r>
-    </w:p>
-    <w:p>
-      <w:pPr>
-        <w:shd w:val="clear" w:color="auto" w:fill="F2F2F2"/>
-        <w:spacing w:before="40" w:after="40"/>
-        <w:ind w:left="360"/>
-      </w:pPr>
-      <w:r>
-        <w:rPr>
-          <w:rFonts w:ascii="Consolas" w:eastAsia="Consolas" w:hAnsi="Consolas" w:cs="Consolas"/>
-          <w:sz w:val="19"/>
-          <w:szCs w:val="19"/>
-        </w:rPr>
-        <w:t xml:space="preserve">    --save-dir figures/</w:t>
-      </w:r>
-    </w:p>
-    <w:p>
-      <w:pPr>
-        <w:spacing w:after="60"/>
-      </w:pPr>
-    </w:p>
-    <w:p>
-      <w:pPr>
-        <w:spacing w:after="120"/>
-      </w:pPr>
-      <w:r>
-        <w:rPr>
-          <w:b/>
-          <w:bCs/>
-        </w:rPr>
-        <w:t xml:space="preserve">The format is: </w:t>
-      </w:r>
-      <w:r>
-        <w:rPr>
-          <w:rFonts w:ascii="Consolas" w:eastAsia="Consolas" w:hAnsi="Consolas" w:cs="Consolas"/>
           <w:sz w:val="20"/>
           <w:szCs w:val="20"/>
+        </w:rPr>
+        <w:t>--</w:t>
+      </w:r>
+      <w:proofErr w:type="spellStart"/>
+      <w:r>
+        <w:rPr>
+          <w:rFonts w:ascii="Consolas" w:eastAsia="Consolas" w:hAnsi="Consolas" w:cs="Consolas"/>
           <w:color w:val="555555"/>
-        </w:rPr>
-        <w:t>path/to/file.txt:conversion_factor</w:t>
-      </w:r>
-      <w:r>
-        <w:t xml:space="preserve"> — note the colon between the filepath and the conversion factor. Each file gets its own conversion factor from dls_calibration.py because different experiments may use different liposome stocks.</w:t>
-      </w:r>
-    </w:p>
-    <w:p>
-      <w:pPr>
-        <w:spacing w:after="60"/>
-      </w:pPr>
-    </w:p>
-    <w:p>
-      <w:pPr>
-        <w:spacing w:after="120"/>
-      </w:pPr>
-      <w:r>
-        <w:rPr>
-          <w:b/>
-          <w:bCs/>
-        </w:rPr>
-        <w:t xml:space="preserve">Labels: </w:t>
-      </w:r>
-      <w:r>
-        <w:t xml:space="preserve">The </w:t>
-      </w:r>
-      <w:r>
-        <w:rPr>
-          <w:rFonts w:ascii="Consolas" w:eastAsia="Consolas" w:hAnsi="Consolas" w:cs="Consolas"/>
           <w:sz w:val="20"/>
           <w:szCs w:val="20"/>
+        </w:rPr>
+        <w:t>pdi</w:t>
+      </w:r>
+      <w:proofErr w:type="spellEnd"/>
+      <w:r>
+        <w:t xml:space="preserve"> commands are optional. Without them, only the ratio-of-means is computed. </w:t>
+      </w:r>
+    </w:p>
+    <w:p>
+      <w:pPr>
+        <w:spacing w:after="60"/>
+      </w:pPr>
+    </w:p>
+    <w:p>
+      <w:pPr>
+        <w:spacing w:after="120"/>
+      </w:pPr>
+      <w:r>
+        <w:t>It will print three conversion factors and show how to use each. Use the log-normal conversion factor with --conversion-factor, or the ratio-of-means diameter with --dls-mean-diameter, in Steps 4a and 4b.</w:t>
+      </w:r>
+    </w:p>
+    <w:p>
+      <w:pPr>
+        <w:spacing w:after="60"/>
+      </w:pPr>
+    </w:p>
+    <w:p>
+      <w:pPr>
+        <w:spacing w:after="120"/>
+        <w:rPr>
           <w:color w:val="555555"/>
         </w:rPr>
+      </w:pPr>
+      <w:r>
+        <w:rPr>
+          <w:b/>
+          <w:bCs/>
+          <w:color w:val="2B5797"/>
+        </w:rPr>
+        <w:t>ℹ</w:t>
+      </w:r>
+      <w:r>
+        <w:rPr>
+          <w:b/>
+          <w:bCs/>
+          <w:color w:val="2B5797"/>
+        </w:rPr>
+        <w:t>️</w:t>
+      </w:r>
+      <w:r>
+        <w:rPr>
+          <w:b/>
+          <w:bCs/>
+          <w:color w:val="2B5797"/>
+        </w:rPr>
+        <w:t xml:space="preserve"> Note: </w:t>
+      </w:r>
+      <w:r>
+        <w:rPr>
+          <w:color w:val="555555"/>
+        </w:rPr>
+        <w:t>The DLS spreadsheet must include the intensity distribution (for log-normal fitting) and the number distribution (for ratio-of-means). Export the size distribution from the Zetasizer software and copy it into an Excel file with the standard section headers (“X Intensity”, “X Volume”, “X Number”). You also need the Z-average and PDI from the Zetasizer cumulants summary report.</w:t>
+      </w:r>
+    </w:p>
+    <w:p>
+      <w:pPr>
+        <w:pStyle w:val="Heading1"/>
+      </w:pPr>
+      <w:r>
+        <w:t>Optional: Plotting the DLS and Comparing DLS and Fluorescence Distributions</w:t>
+      </w:r>
+    </w:p>
+    <w:p>
+      <w:pPr>
+        <w:spacing w:after="120"/>
+      </w:pPr>
+      <w:r>
+        <w:t>These utility scripts let you visualize the DLS size distribution and compare it side-by-side with your fluorescence data. Use them as a sanity check to make sure your detected liposome population matches what DLS measured.</w:t>
+      </w:r>
+    </w:p>
+    <w:p>
+      <w:pPr>
+        <w:spacing w:after="60"/>
+      </w:pPr>
+    </w:p>
+    <w:p>
+      <w:pPr>
+        <w:pStyle w:val="Heading2"/>
+      </w:pPr>
+      <w:r>
+        <w:t>Plot DLS Distribution Only</w:t>
+      </w:r>
+    </w:p>
+    <w:p>
+      <w:pPr>
+        <w:spacing w:after="120"/>
+      </w:pPr>
+      <w:r>
+        <w:t>Plots the DLS distribution from your Zetasizer spreadsheet, zoomed to show only the bins with signal. You can choose the number or intensity distribution.</w:t>
+      </w:r>
+    </w:p>
+    <w:p>
+      <w:pPr>
+        <w:spacing w:after="120"/>
+      </w:pPr>
+      <w:r>
+        <w:rPr>
+          <w:b/>
+          <w:bCs/>
+        </w:rPr>
+        <w:t>macOS/Linux:</w:t>
+      </w:r>
+    </w:p>
+    <w:p>
+      <w:pPr>
+        <w:shd w:val="clear" w:color="auto" w:fill="F2F2F2"/>
+        <w:spacing w:before="40" w:after="40"/>
+        <w:ind w:left="360"/>
+      </w:pPr>
+      <w:r>
+        <w:rPr>
+          <w:rFonts w:ascii="Consolas" w:eastAsia="Consolas" w:hAnsi="Consolas" w:cs="Consolas"/>
+          <w:sz w:val="19"/>
+          <w:szCs w:val="19"/>
+        </w:rPr>
+        <w:t>python plot_dls.py data/dls_data.xlsx</w:t>
+      </w:r>
+    </w:p>
+    <w:p>
+      <w:pPr>
+        <w:spacing w:after="60"/>
+      </w:pPr>
+    </w:p>
+    <w:p>
+      <w:pPr>
+        <w:spacing w:after="120"/>
+      </w:pPr>
+      <w:r>
+        <w:rPr>
+          <w:b/>
+          <w:bCs/>
+        </w:rPr>
+        <w:t>Windows PowerShell:</w:t>
+      </w:r>
+    </w:p>
+    <w:p>
+      <w:pPr>
+        <w:shd w:val="clear" w:color="auto" w:fill="F2F2F2"/>
+        <w:spacing w:before="40" w:after="40"/>
+        <w:ind w:left="360"/>
+      </w:pPr>
+      <w:r>
+        <w:rPr>
+          <w:rFonts w:ascii="Consolas" w:eastAsia="Consolas" w:hAnsi="Consolas" w:cs="Consolas"/>
+          <w:sz w:val="19"/>
+          <w:szCs w:val="19"/>
+        </w:rPr>
+        <w:t>python plot_dls.py data\dls_data.xlsx</w:t>
+      </w:r>
+    </w:p>
+    <w:p>
+      <w:pPr>
+        <w:spacing w:after="60"/>
+      </w:pPr>
+    </w:p>
+    <w:p>
+      <w:pPr>
+        <w:spacing w:after="120"/>
+      </w:pPr>
+      <w:r>
+        <w:t xml:space="preserve">Add </w:t>
+      </w:r>
+      <w:r>
+        <w:rPr>
+          <w:rFonts w:ascii="Consolas" w:eastAsia="Consolas" w:hAnsi="Consolas" w:cs="Consolas"/>
+          <w:color w:val="555555"/>
+          <w:sz w:val="20"/>
+          <w:szCs w:val="20"/>
+        </w:rPr>
+        <w:t>--log</w:t>
+      </w:r>
+      <w:r>
+        <w:t xml:space="preserve"> to plot log(diameter) instead. Add </w:t>
+      </w:r>
+      <w:r>
+        <w:rPr>
+          <w:rFonts w:ascii="Consolas" w:eastAsia="Consolas" w:hAnsi="Consolas" w:cs="Consolas"/>
+          <w:color w:val="555555"/>
+          <w:sz w:val="20"/>
+          <w:szCs w:val="20"/>
+        </w:rPr>
+        <w:t>--distribution intensity</w:t>
+      </w:r>
+      <w:r>
+        <w:t xml:space="preserve"> to use the intensity distribution instead of number. Add </w:t>
+      </w:r>
+      <w:r>
+        <w:rPr>
+          <w:rFonts w:ascii="Consolas" w:eastAsia="Consolas" w:hAnsi="Consolas" w:cs="Consolas"/>
+          <w:color w:val="555555"/>
+          <w:sz w:val="20"/>
+          <w:szCs w:val="20"/>
+        </w:rPr>
+        <w:t>--zoom-pct 95</w:t>
+      </w:r>
+      <w:r>
+        <w:t xml:space="preserve"> to zoom to 95% of the data (default is 95%).</w:t>
+      </w:r>
+    </w:p>
+    <w:p>
+      <w:pPr>
+        <w:spacing w:after="60"/>
+      </w:pPr>
+    </w:p>
+    <w:p>
+      <w:pPr>
+        <w:pStyle w:val="Heading2"/>
+      </w:pPr>
+      <w:r>
+        <w:t>Compare DLS and Fluorescence Distributions</w:t>
+      </w:r>
+    </w:p>
+    <w:p>
+      <w:pPr>
+        <w:spacing w:after="120"/>
+      </w:pPr>
+      <w:r>
+        <w:t>Plots the DLS distribution side-by-side with the sqrt(A) histograms for each fluorescence channel. Use this to check whether the shapes match — if they do, your detection is picking up the correct liposome population. You specify channels as pairs: the channel index (0 for ch1, 1 for ch2, etc.) followed by a label.</w:t>
+      </w:r>
+    </w:p>
+    <w:p>
+      <w:pPr>
+        <w:spacing w:after="60"/>
+      </w:pPr>
+    </w:p>
+    <w:p>
+      <w:pPr>
+        <w:spacing w:after="120"/>
+      </w:pPr>
+      <w:r>
+        <w:rPr>
+          <w:b/>
+          <w:bCs/>
+        </w:rPr>
+        <w:t>macOS/Linux:</w:t>
+      </w:r>
+    </w:p>
+    <w:p>
+      <w:pPr>
+        <w:shd w:val="clear" w:color="auto" w:fill="F2F2F2"/>
+        <w:spacing w:before="40" w:after="40"/>
+        <w:ind w:left="360"/>
+      </w:pPr>
+      <w:r>
+        <w:rPr>
+          <w:rFonts w:ascii="Consolas" w:eastAsia="Consolas" w:hAnsi="Consolas" w:cs="Consolas"/>
+          <w:sz w:val="19"/>
+          <w:szCs w:val="19"/>
+        </w:rPr>
+        <w:t>python plot_dls_comparison.py \</w:t>
+      </w:r>
+    </w:p>
+    <w:p>
+      <w:pPr>
+        <w:shd w:val="clear" w:color="auto" w:fill="F2F2F2"/>
+        <w:spacing w:before="40" w:after="40"/>
+        <w:ind w:left="360"/>
+      </w:pPr>
+      <w:r>
+        <w:rPr>
+          <w:rFonts w:ascii="Consolas" w:eastAsia="Consolas" w:hAnsi="Consolas" w:cs="Consolas"/>
+          <w:sz w:val="19"/>
+          <w:szCs w:val="19"/>
+        </w:rPr>
+        <w:t xml:space="preserve">    --dls-input data/dls_data.xlsx \</w:t>
+      </w:r>
+    </w:p>
+    <w:p>
+      <w:pPr>
+        <w:shd w:val="clear" w:color="auto" w:fill="F2F2F2"/>
+        <w:spacing w:before="40" w:after="40"/>
+        <w:ind w:left="360"/>
+      </w:pPr>
+      <w:r>
+        <w:rPr>
+          <w:rFonts w:ascii="Consolas" w:eastAsia="Consolas" w:hAnsi="Consolas" w:cs="Consolas"/>
+          <w:sz w:val="19"/>
+          <w:szCs w:val="19"/>
+        </w:rPr>
+        <w:t xml:space="preserve">    --fluor-input data/.../filtered_puncta_A_values.txt \</w:t>
+      </w:r>
+    </w:p>
+    <w:p>
+      <w:pPr>
+        <w:shd w:val="clear" w:color="auto" w:fill="F2F2F2"/>
+        <w:spacing w:before="40" w:after="40"/>
+        <w:ind w:left="360"/>
+      </w:pPr>
+      <w:r>
+        <w:rPr>
+          <w:rFonts w:ascii="Consolas" w:eastAsia="Consolas" w:hAnsi="Consolas" w:cs="Consolas"/>
+          <w:sz w:val="19"/>
+          <w:szCs w:val="19"/>
+        </w:rPr>
+        <w:t xml:space="preserve">    --channels 0 Lipid 1 EGFP \</w:t>
+      </w:r>
+    </w:p>
+    <w:p>
+      <w:pPr>
+        <w:shd w:val="clear" w:color="auto" w:fill="F2F2F2"/>
+        <w:spacing w:before="40" w:after="40"/>
+        <w:ind w:left="360"/>
+      </w:pPr>
+      <w:r>
+        <w:rPr>
+          <w:rFonts w:ascii="Consolas" w:eastAsia="Consolas" w:hAnsi="Consolas" w:cs="Consolas"/>
+          <w:sz w:val="19"/>
+          <w:szCs w:val="19"/>
+        </w:rPr>
+        <w:t xml:space="preserve">    --zoom-pct 95 --bins 200 --save-dir figures/</w:t>
+      </w:r>
+    </w:p>
+    <w:p>
+      <w:pPr>
+        <w:spacing w:after="60"/>
+      </w:pPr>
+    </w:p>
+    <w:p>
+      <w:pPr>
+        <w:spacing w:after="120"/>
+      </w:pPr>
+      <w:r>
+        <w:rPr>
+          <w:b/>
+          <w:bCs/>
+        </w:rPr>
+        <w:t>Windows PowerShell:</w:t>
+      </w:r>
+    </w:p>
+    <w:p>
+      <w:pPr>
+        <w:shd w:val="clear" w:color="auto" w:fill="F2F2F2"/>
+        <w:spacing w:before="40" w:after="40"/>
+        <w:ind w:left="360"/>
+      </w:pPr>
+      <w:r>
+        <w:rPr>
+          <w:rFonts w:ascii="Consolas" w:eastAsia="Consolas" w:hAnsi="Consolas" w:cs="Consolas"/>
+          <w:sz w:val="19"/>
+          <w:szCs w:val="19"/>
+        </w:rPr>
+        <w:t>python plot_dls_comparison.py `</w:t>
+      </w:r>
+    </w:p>
+    <w:p>
+      <w:pPr>
+        <w:shd w:val="clear" w:color="auto" w:fill="F2F2F2"/>
+        <w:spacing w:before="40" w:after="40"/>
+        <w:ind w:left="360"/>
+      </w:pPr>
+      <w:r>
+        <w:rPr>
+          <w:rFonts w:ascii="Consolas" w:eastAsia="Consolas" w:hAnsi="Consolas" w:cs="Consolas"/>
+          <w:sz w:val="19"/>
+          <w:szCs w:val="19"/>
+        </w:rPr>
+        <w:t xml:space="preserve">    --dls-input data\dls_data.xlsx `</w:t>
+      </w:r>
+    </w:p>
+    <w:p>
+      <w:pPr>
+        <w:shd w:val="clear" w:color="auto" w:fill="F2F2F2"/>
+        <w:spacing w:before="40" w:after="40"/>
+        <w:ind w:left="360"/>
+      </w:pPr>
+      <w:r>
+        <w:rPr>
+          <w:rFonts w:ascii="Consolas" w:eastAsia="Consolas" w:hAnsi="Consolas" w:cs="Consolas"/>
+          <w:sz w:val="19"/>
+          <w:szCs w:val="19"/>
+        </w:rPr>
+        <w:t xml:space="preserve">    --fluor-input data\...\filtered_puncta_A_values.txt `</w:t>
+      </w:r>
+    </w:p>
+    <w:p>
+      <w:pPr>
+        <w:shd w:val="clear" w:color="auto" w:fill="F2F2F2"/>
+        <w:spacing w:before="40" w:after="40"/>
+        <w:ind w:left="360"/>
+      </w:pPr>
+      <w:r>
+        <w:rPr>
+          <w:rFonts w:ascii="Consolas" w:eastAsia="Consolas" w:hAnsi="Consolas" w:cs="Consolas"/>
+          <w:sz w:val="19"/>
+          <w:szCs w:val="19"/>
+        </w:rPr>
+        <w:t xml:space="preserve">    --channels 0 Lipid 1 EGFP `</w:t>
+      </w:r>
+    </w:p>
+    <w:p>
+      <w:pPr>
+        <w:shd w:val="clear" w:color="auto" w:fill="F2F2F2"/>
+        <w:spacing w:before="40" w:after="40"/>
+        <w:ind w:left="360"/>
+      </w:pPr>
+      <w:r>
+        <w:rPr>
+          <w:rFonts w:ascii="Consolas" w:eastAsia="Consolas" w:hAnsi="Consolas" w:cs="Consolas"/>
+          <w:sz w:val="19"/>
+          <w:szCs w:val="19"/>
+        </w:rPr>
+        <w:t xml:space="preserve">    --zoom-pct 95 --bins 200 --save-dir figures/</w:t>
+      </w:r>
+    </w:p>
+    <w:p>
+      <w:pPr>
+        <w:spacing w:after="60"/>
+      </w:pPr>
+    </w:p>
+    <w:p>
+      <w:pPr>
+        <w:spacing w:after="120"/>
+      </w:pPr>
+      <w:r>
+        <w:rPr>
+          <w:b/>
+          <w:bCs/>
+        </w:rPr>
+        <w:t xml:space="preserve">How channels work: </w:t>
+      </w:r>
+      <w:r>
+        <w:t>You specify channels as pairs of index and label. Index 0 corresponds to A_ch1 (typically lipid), index 1 to A_ch2 (typically protein), and so on. The label is what appears in the plot title (e.g., “Lipid”, “EGFP”). You can include as many channels as you want — each gets its own panel.</w:t>
+      </w:r>
+    </w:p>
+    <w:p>
+      <w:pPr>
+        <w:spacing w:after="60"/>
+      </w:pPr>
+    </w:p>
+    <w:p>
+      <w:pPr>
+        <w:spacing w:after="120"/>
+      </w:pPr>
+      <w:r>
+        <w:rPr>
+          <w:b/>
+          <w:bCs/>
+        </w:rPr>
+        <w:t xml:space="preserve">Zoom: </w:t>
+      </w:r>
+      <w:r>
+        <w:t xml:space="preserve">The </w:t>
+      </w:r>
+      <w:r>
+        <w:rPr>
+          <w:rFonts w:ascii="Consolas" w:eastAsia="Consolas" w:hAnsi="Consolas" w:cs="Consolas"/>
+          <w:color w:val="555555"/>
+          <w:sz w:val="20"/>
+          <w:szCs w:val="20"/>
+        </w:rPr>
+        <w:t>--zoom-pct</w:t>
+      </w:r>
+      <w:r>
+        <w:t xml:space="preserve"> flag controls how much of the data to show. Default is 100% (no zoom). Set to 95 to zoom into the central 95% and hide outlier tails. The DLS and fluorescence panels are each zoomed independently based on their own distributions.</w:t>
+      </w:r>
+    </w:p>
+    <w:p>
+      <w:pPr>
+        <w:pStyle w:val="Heading1"/>
+      </w:pPr>
+      <w:r>
+        <w:lastRenderedPageBreak/>
+        <w:t>Optional: Normalized Overlay Across Experiments</w:t>
+      </w:r>
+    </w:p>
+    <w:p>
+      <w:pPr>
+        <w:spacing w:after="120"/>
+      </w:pPr>
+      <w:r>
+        <w:t>If you have multiple experiments (different proteins, conditions, or replicates) and want to compare their curvature sorting on a single plot, use the overlay script. It normalizes each curve so the largest-radius bin equals 1, then overlays just the binned averages. The y-axis shows fold-enrichment at high curvature relative to flat membranes.</w:t>
+      </w:r>
+    </w:p>
+    <w:p>
+      <w:pPr>
+        <w:spacing w:after="60"/>
+      </w:pPr>
+    </w:p>
+    <w:p>
+      <w:pPr>
+        <w:spacing w:after="120"/>
+      </w:pPr>
+      <w:r>
+        <w:rPr>
+          <w:b/>
+          <w:bCs/>
+        </w:rPr>
+        <w:t xml:space="preserve">Key detail: </w:t>
+      </w:r>
+      <w:r>
+        <w:t>Each input file gets its own conversion factor (from dls_calibration.py), specified with a colon after the filepath. This is important because different liposome stocks may have different size distributions.</w:t>
+      </w:r>
+    </w:p>
+    <w:p>
+      <w:pPr>
+        <w:spacing w:after="60"/>
+      </w:pPr>
+    </w:p>
+    <w:p>
+      <w:pPr>
+        <w:spacing w:after="120"/>
+      </w:pPr>
+      <w:r>
+        <w:rPr>
+          <w:b/>
+          <w:bCs/>
+        </w:rPr>
+        <w:t>macOS/Linux:</w:t>
+      </w:r>
+    </w:p>
+    <w:p>
+      <w:pPr>
+        <w:shd w:val="clear" w:color="auto" w:fill="F2F2F2"/>
+        <w:spacing w:before="40" w:after="40"/>
+        <w:ind w:left="360"/>
+      </w:pPr>
+      <w:r>
+        <w:rPr>
+          <w:rFonts w:ascii="Consolas" w:eastAsia="Consolas" w:hAnsi="Consolas" w:cs="Consolas"/>
+          <w:sz w:val="19"/>
+          <w:szCs w:val="19"/>
+        </w:rPr>
+        <w:t>python plot_overlay.py \</w:t>
+      </w:r>
+    </w:p>
+    <w:p>
+      <w:pPr>
+        <w:shd w:val="clear" w:color="auto" w:fill="F2F2F2"/>
+        <w:spacing w:before="40" w:after="40"/>
+        <w:ind w:left="360"/>
+      </w:pPr>
+      <w:r>
+        <w:rPr>
+          <w:rFonts w:ascii="Consolas" w:eastAsia="Consolas" w:hAnsi="Consolas" w:cs="Consolas"/>
+          <w:sz w:val="19"/>
+          <w:szCs w:val="19"/>
+        </w:rPr>
+        <w:t xml:space="preserve">    --input data/cond1/filtered_puncta_A_values.txt:1.234 \</w:t>
+      </w:r>
+    </w:p>
+    <w:p>
+      <w:pPr>
+        <w:shd w:val="clear" w:color="auto" w:fill="F2F2F2"/>
+        <w:spacing w:before="40" w:after="40"/>
+        <w:ind w:left="360"/>
+      </w:pPr>
+      <w:r>
+        <w:rPr>
+          <w:rFonts w:ascii="Consolas" w:eastAsia="Consolas" w:hAnsi="Consolas" w:cs="Consolas"/>
+          <w:sz w:val="19"/>
+          <w:szCs w:val="19"/>
+        </w:rPr>
+        <w:t xml:space="preserve">           data/cond2/filtered_puncta_A_values.txt:1.567 \</w:t>
+      </w:r>
+    </w:p>
+    <w:p>
+      <w:pPr>
+        <w:shd w:val="clear" w:color="auto" w:fill="F2F2F2"/>
+        <w:spacing w:before="40" w:after="40"/>
+        <w:ind w:left="360"/>
+      </w:pPr>
+      <w:r>
+        <w:rPr>
+          <w:rFonts w:ascii="Consolas" w:eastAsia="Consolas" w:hAnsi="Consolas" w:cs="Consolas"/>
+          <w:sz w:val="19"/>
+          <w:szCs w:val="19"/>
+        </w:rPr>
+        <w:t xml:space="preserve">    --labels "WT protein" "Mutant K58A" \</w:t>
+      </w:r>
+    </w:p>
+    <w:p>
+      <w:pPr>
+        <w:shd w:val="clear" w:color="auto" w:fill="F2F2F2"/>
+        <w:spacing w:before="40" w:after="40"/>
+        <w:ind w:left="360"/>
+      </w:pPr>
+      <w:r>
+        <w:rPr>
+          <w:rFonts w:ascii="Consolas" w:eastAsia="Consolas" w:hAnsi="Consolas" w:cs="Consolas"/>
+          <w:sz w:val="19"/>
+          <w:szCs w:val="19"/>
+        </w:rPr>
+        <w:t xml:space="preserve">    --save-dir figures/</w:t>
+      </w:r>
+    </w:p>
+    <w:p>
+      <w:pPr>
+        <w:spacing w:after="60"/>
+      </w:pPr>
+    </w:p>
+    <w:p>
+      <w:pPr>
+        <w:spacing w:after="120"/>
+      </w:pPr>
+      <w:r>
+        <w:rPr>
+          <w:b/>
+          <w:bCs/>
+        </w:rPr>
+        <w:t>Windows PowerShell:</w:t>
+      </w:r>
+    </w:p>
+    <w:p>
+      <w:pPr>
+        <w:shd w:val="clear" w:color="auto" w:fill="F2F2F2"/>
+        <w:spacing w:before="40" w:after="40"/>
+        <w:ind w:left="360"/>
+      </w:pPr>
+      <w:r>
+        <w:rPr>
+          <w:rFonts w:ascii="Consolas" w:eastAsia="Consolas" w:hAnsi="Consolas" w:cs="Consolas"/>
+          <w:sz w:val="19"/>
+          <w:szCs w:val="19"/>
+        </w:rPr>
+        <w:t>python plot_overlay.py `</w:t>
+      </w:r>
+    </w:p>
+    <w:p>
+      <w:pPr>
+        <w:shd w:val="clear" w:color="auto" w:fill="F2F2F2"/>
+        <w:spacing w:before="40" w:after="40"/>
+        <w:ind w:left="360"/>
+      </w:pPr>
+      <w:r>
+        <w:rPr>
+          <w:rFonts w:ascii="Consolas" w:eastAsia="Consolas" w:hAnsi="Consolas" w:cs="Consolas"/>
+          <w:sz w:val="19"/>
+          <w:szCs w:val="19"/>
+        </w:rPr>
+        <w:t xml:space="preserve">    --input data\cond1\filtered_puncta_A_values.txt:1.234 `</w:t>
+      </w:r>
+    </w:p>
+    <w:p>
+      <w:pPr>
+        <w:shd w:val="clear" w:color="auto" w:fill="F2F2F2"/>
+        <w:spacing w:before="40" w:after="40"/>
+        <w:ind w:left="360"/>
+      </w:pPr>
+      <w:r>
+        <w:rPr>
+          <w:rFonts w:ascii="Consolas" w:eastAsia="Consolas" w:hAnsi="Consolas" w:cs="Consolas"/>
+          <w:sz w:val="19"/>
+          <w:szCs w:val="19"/>
+        </w:rPr>
+        <w:t xml:space="preserve">           data\cond2\filtered_puncta_A_values.txt:1.567 `</w:t>
+      </w:r>
+    </w:p>
+    <w:p>
+      <w:pPr>
+        <w:shd w:val="clear" w:color="auto" w:fill="F2F2F2"/>
+        <w:spacing w:before="40" w:after="40"/>
+        <w:ind w:left="360"/>
+      </w:pPr>
+      <w:r>
+        <w:rPr>
+          <w:rFonts w:ascii="Consolas" w:eastAsia="Consolas" w:hAnsi="Consolas" w:cs="Consolas"/>
+          <w:sz w:val="19"/>
+          <w:szCs w:val="19"/>
+        </w:rPr>
+        <w:t xml:space="preserve">    --labels "WT protein" "Mutant K58A" `</w:t>
+      </w:r>
+    </w:p>
+    <w:p>
+      <w:pPr>
+        <w:shd w:val="clear" w:color="auto" w:fill="F2F2F2"/>
+        <w:spacing w:before="40" w:after="40"/>
+        <w:ind w:left="360"/>
+      </w:pPr>
+      <w:r>
+        <w:rPr>
+          <w:rFonts w:ascii="Consolas" w:eastAsia="Consolas" w:hAnsi="Consolas" w:cs="Consolas"/>
+          <w:sz w:val="19"/>
+          <w:szCs w:val="19"/>
+        </w:rPr>
+        <w:t xml:space="preserve">    --save-dir figures/</w:t>
+      </w:r>
+    </w:p>
+    <w:p>
+      <w:pPr>
+        <w:spacing w:after="60"/>
+      </w:pPr>
+    </w:p>
+    <w:p>
+      <w:pPr>
+        <w:spacing w:after="120"/>
+      </w:pPr>
+      <w:r>
+        <w:rPr>
+          <w:b/>
+          <w:bCs/>
+        </w:rPr>
+        <w:t xml:space="preserve">The format is: </w:t>
+      </w:r>
+      <w:r>
+        <w:rPr>
+          <w:rFonts w:ascii="Consolas" w:eastAsia="Consolas" w:hAnsi="Consolas" w:cs="Consolas"/>
+          <w:color w:val="555555"/>
+          <w:sz w:val="20"/>
+          <w:szCs w:val="20"/>
+        </w:rPr>
+        <w:t>path/to/file.txt:conversion_factor</w:t>
+      </w:r>
+      <w:r>
+        <w:t xml:space="preserve"> — note the colon between the filepath and the conversion factor. Each file gets its own conversion factor from dls_calibration.py because different experiments may use different liposome stocks.</w:t>
+      </w:r>
+    </w:p>
+    <w:p>
+      <w:pPr>
+        <w:spacing w:after="60"/>
+      </w:pPr>
+    </w:p>
+    <w:p>
+      <w:pPr>
+        <w:spacing w:after="120"/>
+      </w:pPr>
+      <w:r>
+        <w:rPr>
+          <w:b/>
+          <w:bCs/>
+        </w:rPr>
+        <w:t xml:space="preserve">Labels: </w:t>
+      </w:r>
+      <w:r>
+        <w:t xml:space="preserve">The </w:t>
+      </w:r>
+      <w:r>
+        <w:rPr>
+          <w:rFonts w:ascii="Consolas" w:eastAsia="Consolas" w:hAnsi="Consolas" w:cs="Consolas"/>
+          <w:color w:val="555555"/>
+          <w:sz w:val="20"/>
+          <w:szCs w:val="20"/>
+        </w:rPr>
         <w:t>--labels</w:t>
       </w:r>
       <w:r>
@@ -5963,7 +6546,7 @@
         <w:t xml:space="preserve">Output: </w:t>
       </w:r>
       <w:r>
-        <w:t xml:space="preserve">A PNG saved in figures/ with all curves overlaid. A dashed gray line at y = 1 marks the baseline. Curves that rise above 1 toward smaller radii indicate curvature sensing.</w:t>
+        <w:t>A PNG saved in figures/ with all curves overlaid. A dashed gray line at y = 1 marks the baseline. Curves that rise above 1 toward smaller radii indicate curvature sensing.</w:t>
       </w:r>
     </w:p>
     <w:p>
@@ -6030,6 +6613,7 @@
         <w:spacing w:after="80"/>
       </w:pPr>
       <w:r>
+        <w:lastRenderedPageBreak/>
         <w:t xml:space="preserve">Activate the venv: </w:t>
       </w:r>
       <w:r>
@@ -6218,12 +6802,6 @@
         <w:gridCol w:w="5360"/>
       </w:tblGrid>
       <w:tr>
-        <w:tblPrEx>
-          <w:tblCellMar>
-            <w:top w:w="0" w:type="dxa"/>
-            <w:bottom w:w="0" w:type="dxa"/>
-          </w:tblCellMar>
-        </w:tblPrEx>
         <w:tc>
           <w:tcPr>
             <w:tcW w:w="4000" w:type="dxa"/>
@@ -6280,12 +6858,6 @@
         </w:tc>
       </w:tr>
       <w:tr>
-        <w:tblPrEx>
-          <w:tblCellMar>
-            <w:top w:w="0" w:type="dxa"/>
-            <w:bottom w:w="0" w:type="dxa"/>
-          </w:tblCellMar>
-        </w:tblPrEx>
         <w:tc>
           <w:tcPr>
             <w:tcW w:w="4000" w:type="dxa"/>
@@ -6332,12 +6904,6 @@
         </w:tc>
       </w:tr>
       <w:tr>
-        <w:tblPrEx>
-          <w:tblCellMar>
-            <w:top w:w="0" w:type="dxa"/>
-            <w:bottom w:w="0" w:type="dxa"/>
-          </w:tblCellMar>
-        </w:tblPrEx>
         <w:tc>
           <w:tcPr>
             <w:tcW w:w="4000" w:type="dxa"/>
@@ -6384,12 +6950,6 @@
         </w:tc>
       </w:tr>
       <w:tr>
-        <w:tblPrEx>
-          <w:tblCellMar>
-            <w:top w:w="0" w:type="dxa"/>
-            <w:bottom w:w="0" w:type="dxa"/>
-          </w:tblCellMar>
-        </w:tblPrEx>
         <w:tc>
           <w:tcPr>
             <w:tcW w:w="4000" w:type="dxa"/>
@@ -6436,12 +6996,6 @@
         </w:tc>
       </w:tr>
       <w:tr>
-        <w:tblPrEx>
-          <w:tblCellMar>
-            <w:top w:w="0" w:type="dxa"/>
-            <w:bottom w:w="0" w:type="dxa"/>
-          </w:tblCellMar>
-        </w:tblPrEx>
         <w:tc>
           <w:tcPr>
             <w:tcW w:w="4000" w:type="dxa"/>
@@ -6488,12 +7042,6 @@
         </w:tc>
       </w:tr>
       <w:tr>
-        <w:tblPrEx>
-          <w:tblCellMar>
-            <w:top w:w="0" w:type="dxa"/>
-            <w:bottom w:w="0" w:type="dxa"/>
-          </w:tblCellMar>
-        </w:tblPrEx>
         <w:tc>
           <w:tcPr>
             <w:tcW w:w="4000" w:type="dxa"/>
@@ -6540,12 +7088,6 @@
         </w:tc>
       </w:tr>
       <w:tr>
-        <w:tblPrEx>
-          <w:tblCellMar>
-            <w:top w:w="0" w:type="dxa"/>
-            <w:bottom w:w="0" w:type="dxa"/>
-          </w:tblCellMar>
-        </w:tblPrEx>
         <w:tc>
           <w:tcPr>
             <w:tcW w:w="4000" w:type="dxa"/>
@@ -6564,7 +7106,6 @@
           </w:tcPr>
           <w:p>
             <w:r>
-              <w:lastRenderedPageBreak/>
               <w:t>"missing detection file"</w:t>
             </w:r>
           </w:p>
@@ -6593,12 +7134,6 @@
         </w:tc>
       </w:tr>
       <w:tr>
-        <w:tblPrEx>
-          <w:tblCellMar>
-            <w:top w:w="0" w:type="dxa"/>
-            <w:bottom w:w="0" w:type="dxa"/>
-          </w:tblCellMar>
-        </w:tblPrEx>
         <w:tc>
           <w:tcPr>
             <w:tcW w:w="4000" w:type="dxa"/>
@@ -6645,12 +7180,6 @@
         </w:tc>
       </w:tr>
       <w:tr>
-        <w:tblPrEx>
-          <w:tblCellMar>
-            <w:top w:w="0" w:type="dxa"/>
-            <w:bottom w:w="0" w:type="dxa"/>
-          </w:tblCellMar>
-        </w:tblPrEx>
         <w:tc>
           <w:tcPr>
             <w:tcW w:w="4000" w:type="dxa"/>
@@ -6697,12 +7226,6 @@
         </w:tc>
       </w:tr>
       <w:tr>
-        <w:tblPrEx>
-          <w:tblCellMar>
-            <w:top w:w="0" w:type="dxa"/>
-            <w:bottom w:w="0" w:type="dxa"/>
-          </w:tblCellMar>
-        </w:tblPrEx>
         <w:tc>
           <w:tcPr>
             <w:tcW w:w="4000" w:type="dxa"/>
@@ -6749,12 +7272,6 @@
         </w:tc>
       </w:tr>
       <w:tr>
-        <w:tblPrEx>
-          <w:tblCellMar>
-            <w:top w:w="0" w:type="dxa"/>
-            <w:bottom w:w="0" w:type="dxa"/>
-          </w:tblCellMar>
-        </w:tblPrEx>
         <w:tc>
           <w:tcPr>
             <w:tcW w:w="4000" w:type="dxa"/>
@@ -7915,6 +8432,7 @@
   <w:style w:type="character" w:default="1" w:styleId="DefaultParagraphFont">
     <w:name w:val="Default Paragraph Font"/>
     <w:uiPriority w:val="1"/>
+    <w:semiHidden/>
     <w:unhideWhenUsed/>
   </w:style>
   <w:style w:type="table" w:default="1" w:styleId="TableNormal">

</xml_diff>